<commit_message>
Refresh operating guide Word doc with Other Receipts reclassification
Co-Authored-By: Claude Sonnet 5 <noreply@anthropic.com>
</commit_message>
<xml_diff>
--- a/pfs-daily-operating-guide.docx
+++ b/pfs-daily-operating-guide.docx
@@ -888,20 +888,20 @@
               <w:rPr>
                 <w:sz w:val="19"/>
               </w:rPr>
-              <w:t xml:space="preserve">What the business has genuinely earned — interest, commission, susu fees, card fees, SMS fees, processing fees. This is </w:t>
-            </w:r>
-            <w:r>
-              <w:rPr>
-                <w:i/>
-                <w:sz w:val="19"/>
-              </w:rPr>
-              <w:t>your</w:t>
-            </w:r>
-            <w:r>
-              <w:rPr>
-                <w:sz w:val="19"/>
-              </w:rPr>
-              <w:t xml:space="preserve"> money, separate from client deposits.</w:t>
+              <w:t xml:space="preserve">What the business has genuinely earned — loan interest, withdrawal commission, susu fees, processing fees. Card fees and SMS fees are real receipts too, but the business classifies those as </w:t>
+            </w:r>
+            <w:r>
+              <w:rPr>
+                <w:b/>
+                <w:sz w:val="19"/>
+              </w:rPr>
+              <w:t>Other Receipts</w:t>
+            </w:r>
+            <w:r>
+              <w:rPr>
+                <w:sz w:val="19"/>
+              </w:rPr>
+              <w:t>, not income — see the Finance page and §11.1.</w:t>
             </w:r>
           </w:p>
         </w:tc>
@@ -2372,13 +2372,26 @@
                 <w:b/>
                 <w:sz w:val="19"/>
               </w:rPr>
-              <w:t>Revenue</w:t>
-            </w:r>
-            <w:r>
-              <w:rPr>
-                <w:sz w:val="19"/>
-              </w:rPr>
-              <w:t xml:space="preserve"> (Fee Income)</w:t>
+              <w:t>Other Receipt</w:t>
+            </w:r>
+            <w:r>
+              <w:rPr>
+                <w:sz w:val="19"/>
+              </w:rPr>
+              <w:t xml:space="preserve"> — real cash, </w:t>
+            </w:r>
+            <w:r>
+              <w:rPr>
+                <w:b/>
+                <w:sz w:val="19"/>
+              </w:rPr>
+              <w:t>not income</w:t>
+            </w:r>
+            <w:r>
+              <w:rPr>
+                <w:sz w:val="19"/>
+              </w:rPr>
+              <w:t xml:space="preserve"> (owner's explicit classification)</w:t>
             </w:r>
           </w:p>
         </w:tc>
@@ -2396,7 +2409,7 @@
               <w:rPr>
                 <w:sz w:val="19"/>
               </w:rPr>
-              <w:t>Income Statement</w:t>
+              <w:t>Balance Sheet (Equity) only</w:t>
             </w:r>
           </w:p>
         </w:tc>
@@ -2476,13 +2489,26 @@
                 <w:b/>
                 <w:sz w:val="19"/>
               </w:rPr>
-              <w:t>Revenue</w:t>
-            </w:r>
-            <w:r>
-              <w:rPr>
-                <w:sz w:val="19"/>
-              </w:rPr>
-              <w:t xml:space="preserve"> (Fee Income)</w:t>
+              <w:t>Other Receipt</w:t>
+            </w:r>
+            <w:r>
+              <w:rPr>
+                <w:sz w:val="19"/>
+              </w:rPr>
+              <w:t xml:space="preserve"> — real cash, </w:t>
+            </w:r>
+            <w:r>
+              <w:rPr>
+                <w:b/>
+                <w:sz w:val="19"/>
+              </w:rPr>
+              <w:t>not income</w:t>
+            </w:r>
+            <w:r>
+              <w:rPr>
+                <w:sz w:val="19"/>
+              </w:rPr>
+              <w:t xml:space="preserve"> (owner's explicit classification)</w:t>
             </w:r>
           </w:p>
         </w:tc>
@@ -2501,7 +2527,7 @@
               <w:rPr>
                 <w:sz w:val="19"/>
               </w:rPr>
-              <w:t>Income Statement</w:t>
+              <w:t>Balance Sheet (Equity) only</w:t>
             </w:r>
           </w:p>
         </w:tc>
@@ -2661,7 +2687,7 @@
               <w:rPr>
                 <w:sz w:val="19"/>
               </w:rPr>
-              <w:t>(#4+#5+#6+#7+#8+#9, each only if switched on) − #3</w:t>
+              <w:t>(#4+#5+#6+#9, each only if switched on) − #3</w:t>
             </w:r>
           </w:p>
         </w:tc>
@@ -2680,7 +2706,14 @@
               <w:rPr>
                 <w:sz w:val="19"/>
               </w:rPr>
-              <w:t>Income Statement subtotal</w:t>
+              <w:t xml:space="preserve">Income Statement subtotal — </w:t>
+            </w:r>
+            <w:r>
+              <w:rPr>
+                <w:b/>
+                <w:sz w:val="19"/>
+              </w:rPr>
+              <w:t>excludes #7, #8</w:t>
             </w:r>
           </w:p>
         </w:tc>
@@ -2965,7 +2998,7 @@
               <w:rPr>
                 <w:sz w:val="19"/>
               </w:rPr>
-              <w:t>Liability contra-movement subtotal</w:t>
+              <w:t>Liability contra-movement subtotal (a cash-flow figure — includes #8 regardless of #8's income classification)</w:t>
             </w:r>
           </w:p>
         </w:tc>
@@ -3521,7 +3554,7 @@
                 <w:b/>
                 <w:sz w:val="19"/>
               </w:rPr>
-              <w:t>Cash at Bank / Cash at Hand</w:t>
+              <w:t>Total Other Receipts</w:t>
             </w:r>
           </w:p>
         </w:tc>
@@ -3539,7 +3572,7 @@
               <w:rPr>
                 <w:sz w:val="19"/>
               </w:rPr>
-              <w:t>See §11.4</w:t>
+              <w:t>#7 + #8</w:t>
             </w:r>
           </w:p>
         </w:tc>
@@ -3558,6 +3591,73 @@
                 <w:b/>
                 <w:sz w:val="19"/>
               </w:rPr>
+              <w:t>Not income</w:t>
+            </w:r>
+            <w:r>
+              <w:rPr>
+                <w:sz w:val="19"/>
+              </w:rPr>
+              <w:t xml:space="preserve"> — real cash received, reported as its own line, never folded into Total Revenue</w:t>
+            </w:r>
+          </w:p>
+        </w:tc>
+      </w:tr>
+      <w:tr>
+        <w:tc>
+          <w:tcPr>
+            <w:tcW w:type="dxa" w:w="3249"/>
+            <w:shd w:val="clear" w:color="auto" w:fill="F2F5FB"/>
+          </w:tcPr>
+          <w:p>
+            <w:r>
+              <w:rPr>
+                <w:sz w:val="19"/>
+              </w:rPr>
+            </w:r>
+            <w:r>
+              <w:rPr>
+                <w:b/>
+                <w:sz w:val="19"/>
+              </w:rPr>
+              <w:t>Cash at Bank / Cash at Hand</w:t>
+            </w:r>
+          </w:p>
+        </w:tc>
+        <w:tc>
+          <w:tcPr>
+            <w:tcW w:type="dxa" w:w="3249"/>
+            <w:shd w:val="clear" w:color="auto" w:fill="F2F5FB"/>
+          </w:tcPr>
+          <w:p>
+            <w:r>
+              <w:rPr>
+                <w:sz w:val="19"/>
+              </w:rPr>
+            </w:r>
+            <w:r>
+              <w:rPr>
+                <w:sz w:val="19"/>
+              </w:rPr>
+              <w:t>See §11.4</w:t>
+            </w:r>
+          </w:p>
+        </w:tc>
+        <w:tc>
+          <w:tcPr>
+            <w:tcW w:type="dxa" w:w="3249"/>
+            <w:shd w:val="clear" w:color="auto" w:fill="F2F5FB"/>
+          </w:tcPr>
+          <w:p>
+            <w:r>
+              <w:rPr>
+                <w:sz w:val="19"/>
+              </w:rPr>
+            </w:r>
+            <w:r>
+              <w:rPr>
+                <w:b/>
+                <w:sz w:val="19"/>
+              </w:rPr>
               <w:t>Asset</w:t>
             </w:r>
             <w:r>
@@ -3572,6 +3672,20 @@
     </w:tbl>
     <w:p/>
     <w:p>
+      <w:r>
+        <w:t xml:space="preserve">&gt; </w:t>
+      </w:r>
+      <w:r>
+        <w:rPr>
+          <w:b/>
+        </w:rPr>
+        <w:t>Why #7 and #8 aren't Revenue:</w:t>
+      </w:r>
+      <w:r>
+        <w:t xml:space="preserve"> this is a business classification the owner has made explicitly, not a generic accounting default — Card Fees and Monthly SMS Fees are real money the company receives, but they are not counted as Company Income. They still behave exactly like income everywhere that matters for cash purposes (added back into Account Balance, still included in Total Withdrawals/Total Debits since they're still deducted from a client's balance) — they simply never appear inside Total Revenue or Net Income.</w:t>
+      </w:r>
+    </w:p>
+    <w:p>
       <w:pPr>
         <w:pStyle w:val="Heading2"/>
       </w:pPr>
@@ -3584,7 +3698,16 @@
     </w:p>
     <w:p>
       <w:r>
-        <w:t>Standard accrual-style P&amp;L: revenue earned this period, less operating expenses, equals Net Income — which then becomes part of Equity on the Balance Sheet.</w:t>
+        <w:t xml:space="preserve">Standard accrual-style P&amp;L: </w:t>
+      </w:r>
+      <w:r>
+        <w:rPr>
+          <w:b/>
+        </w:rPr>
+        <w:t>Company Income only</w:t>
+      </w:r>
+      <w:r>
+        <w:t xml:space="preserve"> earned this period, less operating expenses, equals Net Income — which then becomes part of Equity on the Balance Sheet. Card Fees and SMS Fees are deliberately excluded — see the note above.</w:t>
       </w:r>
     </w:p>
     <w:p>
@@ -3598,7 +3721,7 @@
           <w:color w:val="0A2240"/>
           <w:sz w:val="18"/>
         </w:rPr>
-        <w:t>REVENUE</w:t>
+        <w:t>COMPANY INCOME</w:t>
       </w:r>
       <w:r>
         <w:br/>
@@ -3642,28 +3765,6 @@
           <w:color w:val="0A2240"/>
           <w:sz w:val="18"/>
         </w:rPr>
-        <w:t xml:space="preserve">  Fee Income — Card (registration) ...................... #7</w:t>
-      </w:r>
-      <w:r>
-        <w:br/>
-      </w:r>
-      <w:r>
-        <w:rPr>
-          <w:rFonts w:ascii="Consolas" w:hAnsi="Consolas"/>
-          <w:color w:val="0A2240"/>
-          <w:sz w:val="18"/>
-        </w:rPr>
-        <w:t xml:space="preserve">  Fee Income — SMS ....................................... #8</w:t>
-      </w:r>
-      <w:r>
-        <w:br/>
-      </w:r>
-      <w:r>
-        <w:rPr>
-          <w:rFonts w:ascii="Consolas" w:hAnsi="Consolas"/>
-          <w:color w:val="0A2240"/>
-          <w:sz w:val="18"/>
-        </w:rPr>
         <w:t xml:space="preserve">  Fee Income — Loan Processing ........................... #9</w:t>
       </w:r>
       <w:r>
@@ -3686,7 +3787,7 @@
           <w:color w:val="0A2240"/>
           <w:sz w:val="18"/>
         </w:rPr>
-        <w:t xml:space="preserve">  Gross Revenue ........................................ Σ(#4..#9, each only if enabled in Settings)</w:t>
+        <w:t xml:space="preserve">  Gross Income ......................................... Σ(#4, #5, #6, #9, each only if enabled in Settings)</w:t>
       </w:r>
       <w:r>
         <w:br/>
@@ -3719,7 +3820,7 @@
           <w:color w:val="0A2240"/>
           <w:sz w:val="18"/>
         </w:rPr>
-        <w:t xml:space="preserve">  TOTAL REVENUE (#10) ...................................  = Gross Revenue − #3</w:t>
+        <w:t xml:space="preserve">  TOTAL REVENUE (#10) ...................................  = Gross Income − #3</w:t>
       </w:r>
       <w:r>
         <w:br/>
@@ -3798,10 +3899,43 @@
         </w:rPr>
         <w:t xml:space="preserve">                                                        ═════════</w:t>
       </w:r>
+      <w:r>
+        <w:br/>
+      </w:r>
+      <w:r>
+        <w:rPr>
+          <w:rFonts w:ascii="Consolas" w:hAnsi="Consolas"/>
+          <w:color w:val="0A2240"/>
+          <w:sz w:val="18"/>
+        </w:rPr>
+        <w:t xml:space="preserve"> </w:t>
+      </w:r>
+      <w:r>
+        <w:br/>
+      </w:r>
+      <w:r>
+        <w:rPr>
+          <w:rFonts w:ascii="Consolas" w:hAnsi="Consolas"/>
+          <w:color w:val="0A2240"/>
+          <w:sz w:val="18"/>
+        </w:rPr>
+        <w:t>MEMO — OTHER RECEIPTS (not part of Net Income, shown for completeness)</w:t>
+      </w:r>
+      <w:r>
+        <w:br/>
+      </w:r>
+      <w:r>
+        <w:rPr>
+          <w:rFonts w:ascii="Consolas" w:hAnsi="Consolas"/>
+          <w:color w:val="0A2240"/>
+          <w:sz w:val="18"/>
+        </w:rPr>
+        <w:t xml:space="preserve">  Card Fees (#7) + SMS Fees (#8) ........................ = Total Other Receipts</w:t>
+      </w:r>
     </w:p>
     <w:p>
       <w:r>
-        <w:t>Net Income is the amount added to Equity (Retained Earnings) once the Consolidated Fund appropriation (#3) has already been carved out above — the two together, #3 plus this period's undeposited Net Income, are what make up total company Equity (§11.3).</w:t>
+        <w:t>Net Income is the amount added to Equity (Retained Earnings) once the Consolidated Fund appropriation (#3) has already been carved out above — the two together, #3 plus this period's undeposited Net Income, are what make up total company Equity (§11.3). Total Other Receipts is real cash too, and lands in Equity the same way (§11.3) — it's just tracked as a separate memo line rather than counted as earned income.</w:t>
       </w:r>
     </w:p>
     <w:p>
@@ -4002,7 +4136,7 @@
           <w:color w:val="0A2240"/>
           <w:sz w:val="18"/>
         </w:rPr>
-        <w:t xml:space="preserve">  Retained Earnings, undeposited ......................... Card Fees(#7) + Commission(#5) + Processing Fees(#9)</w:t>
+        <w:t xml:space="preserve">  Retained Earnings &amp; Other Receipts, undeposited ........ Commission(#5) + Processing Fees(#9) + Susu Fees Swept</w:t>
       </w:r>
       <w:r>
         <w:br/>
@@ -4013,7 +4147,18 @@
           <w:color w:val="0A2240"/>
           <w:sz w:val="18"/>
         </w:rPr>
-        <w:t xml:space="preserve">                                                             + SMS Fees(#8) + Susu Fees Swept − Expenditures(#16)</w:t>
+        <w:t xml:space="preserve">                                                             + Card Fees(#7) + SMS Fees(#8)  ← Other Receipts, not income</w:t>
+      </w:r>
+      <w:r>
+        <w:br/>
+      </w:r>
+      <w:r>
+        <w:rPr>
+          <w:rFonts w:ascii="Consolas" w:hAnsi="Consolas"/>
+          <w:color w:val="0A2240"/>
+          <w:sz w:val="18"/>
+        </w:rPr>
+        <w:t xml:space="preserve">                                                             − Expenditures(#16)</w:t>
       </w:r>
       <w:r>
         <w:br/>
@@ -4035,7 +4180,7 @@
           <w:color w:val="0A2240"/>
           <w:sz w:val="18"/>
         </w:rPr>
-        <w:t xml:space="preserve">  TOTAL EQUITY ............................................ = Consolidated Fund + Retained Earnings, undeposited</w:t>
+        <w:t xml:space="preserve">  TOTAL EQUITY ............................................ = Consolidated Fund + Retained Earnings &amp; Other Receipts, undeposited</w:t>
       </w:r>
       <w:r>
         <w:br/>
@@ -4058,6 +4203,26 @@
           <w:sz w:val="18"/>
         </w:rPr>
         <w:t>CHECK:  TOTAL ASSETS  =  TOTAL LIABILITIES  +  TOTAL EQUITY</w:t>
+      </w:r>
+    </w:p>
+    <w:p>
+      <w:r>
+        <w:rPr>
+          <w:b/>
+        </w:rPr>
+        <w:t>A precise note on that Equity line:</w:t>
+      </w:r>
+      <w:r>
+        <w:t xml:space="preserve"> in a textbook chart of accounts, "Retained Earnings" holds </w:t>
+      </w:r>
+      <w:r>
+        <w:rPr>
+          <w:i/>
+        </w:rPr>
+        <w:t>only</w:t>
+      </w:r>
+      <w:r>
+        <w:t xml:space="preserve"> accumulated Net Income. Here it's deliberately blended with Total Other Receipts (Card Fees + SMS Fees), because both are real, undeposited cash sitting in the same equity pool — the blend is a practical simplification, not a claim that Card/SMS Fees are income. If you ever need the two split apart on a formal statement, subtract Total Other Receipts (§11.1) from this line to get the pure Retained Earnings figure.</w:t>
       </w:r>
     </w:p>
     <w:p>
@@ -4592,7 +4757,7 @@
               <w:rPr>
                 <w:sz w:val="19"/>
               </w:rPr>
-              <w:t>#10</w:t>
+              <w:t>#10 (Company Income only — excludes Card Fees/SMS Fees)</w:t>
             </w:r>
           </w:p>
         </w:tc>
@@ -4651,7 +4816,7 @@
               <w:rPr>
                 <w:sz w:val="19"/>
               </w:rPr>
-              <w:t>Card Fees</w:t>
+              <w:t>Other Receipts</w:t>
             </w:r>
           </w:p>
         </w:tc>
@@ -4670,7 +4835,7 @@
               <w:rPr>
                 <w:sz w:val="19"/>
               </w:rPr>
-              <w:t>#7</w:t>
+              <w:t>#7 + #8 (Card Fees + SMS Fees — not income)</w:t>
             </w:r>
           </w:p>
         </w:tc>
@@ -4690,7 +4855,7 @@
               <w:rPr>
                 <w:sz w:val="19"/>
               </w:rPr>
-              <w:t>Loan Interest</w:t>
+              <w:t>Card Fees</w:t>
             </w:r>
           </w:p>
         </w:tc>
@@ -4708,7 +4873,7 @@
               <w:rPr>
                 <w:sz w:val="19"/>
               </w:rPr>
-              <w:t>#4</w:t>
+              <w:t>#7</w:t>
             </w:r>
           </w:p>
         </w:tc>
@@ -4729,7 +4894,7 @@
               <w:rPr>
                 <w:sz w:val="19"/>
               </w:rPr>
-              <w:t>Withdrawal Commission</w:t>
+              <w:t>Loan Interest</w:t>
             </w:r>
           </w:p>
         </w:tc>
@@ -4748,7 +4913,7 @@
               <w:rPr>
                 <w:sz w:val="19"/>
               </w:rPr>
-              <w:t>#5</w:t>
+              <w:t>#4</w:t>
             </w:r>
           </w:p>
         </w:tc>
@@ -4768,7 +4933,7 @@
               <w:rPr>
                 <w:sz w:val="19"/>
               </w:rPr>
-              <w:t>Susu Fees</w:t>
+              <w:t>Withdrawal Commission</w:t>
             </w:r>
           </w:p>
         </w:tc>
@@ -4786,7 +4951,7 @@
               <w:rPr>
                 <w:sz w:val="19"/>
               </w:rPr>
-              <w:t>#6</w:t>
+              <w:t>#5</w:t>
             </w:r>
           </w:p>
         </w:tc>
@@ -4807,7 +4972,7 @@
               <w:rPr>
                 <w:sz w:val="19"/>
               </w:rPr>
-              <w:t>SMS Fees</w:t>
+              <w:t>Susu Fees</w:t>
             </w:r>
           </w:p>
         </w:tc>
@@ -4826,7 +4991,7 @@
               <w:rPr>
                 <w:sz w:val="19"/>
               </w:rPr>
-              <w:t>#8</w:t>
+              <w:t>#6</w:t>
             </w:r>
           </w:p>
         </w:tc>
@@ -4846,7 +5011,7 @@
               <w:rPr>
                 <w:sz w:val="19"/>
               </w:rPr>
-              <w:t>Processing Fees</w:t>
+              <w:t>SMS Fees</w:t>
             </w:r>
           </w:p>
         </w:tc>
@@ -4864,7 +5029,7 @@
               <w:rPr>
                 <w:sz w:val="19"/>
               </w:rPr>
-              <w:t>#9</w:t>
+              <w:t>#8</w:t>
             </w:r>
           </w:p>
         </w:tc>
@@ -4885,7 +5050,7 @@
               <w:rPr>
                 <w:sz w:val="19"/>
               </w:rPr>
-              <w:t>Combined Account Total</w:t>
+              <w:t>Processing Fees</w:t>
             </w:r>
           </w:p>
         </w:tc>
@@ -4904,7 +5069,7 @@
               <w:rPr>
                 <w:sz w:val="19"/>
               </w:rPr>
-              <w:t>#11</w:t>
+              <w:t>#9</w:t>
             </w:r>
           </w:p>
         </w:tc>
@@ -4924,7 +5089,7 @@
               <w:rPr>
                 <w:sz w:val="19"/>
               </w:rPr>
-              <w:t>Total Withdrawals</w:t>
+              <w:t>Combined Account Total</w:t>
             </w:r>
           </w:p>
         </w:tc>
@@ -4942,7 +5107,7 @@
               <w:rPr>
                 <w:sz w:val="19"/>
               </w:rPr>
-              <w:t>#13</w:t>
+              <w:t>#11</w:t>
             </w:r>
           </w:p>
         </w:tc>
@@ -4963,7 +5128,7 @@
               <w:rPr>
                 <w:sz w:val="19"/>
               </w:rPr>
-              <w:t>Loans Disbursed</w:t>
+              <w:t>Total Withdrawals</w:t>
             </w:r>
           </w:p>
         </w:tc>
@@ -4982,7 +5147,7 @@
               <w:rPr>
                 <w:sz w:val="19"/>
               </w:rPr>
-              <w:t>#14</w:t>
+              <w:t>#13</w:t>
             </w:r>
           </w:p>
         </w:tc>
@@ -5002,7 +5167,7 @@
               <w:rPr>
                 <w:sz w:val="19"/>
               </w:rPr>
-              <w:t>Loan Repayments</w:t>
+              <w:t>Loans Disbursed</w:t>
             </w:r>
           </w:p>
         </w:tc>
@@ -5020,7 +5185,7 @@
               <w:rPr>
                 <w:sz w:val="19"/>
               </w:rPr>
-              <w:t>#15</w:t>
+              <w:t>#14</w:t>
             </w:r>
           </w:p>
         </w:tc>
@@ -5041,7 +5206,7 @@
               <w:rPr>
                 <w:sz w:val="19"/>
               </w:rPr>
-              <w:t>Account Balance</w:t>
+              <w:t>Loan Repayments</w:t>
             </w:r>
           </w:p>
         </w:tc>
@@ -5060,7 +5225,7 @@
               <w:rPr>
                 <w:sz w:val="19"/>
               </w:rPr>
-              <w:t>§11.4</w:t>
+              <w:t>#15</w:t>
             </w:r>
           </w:p>
         </w:tc>
@@ -5080,13 +5245,53 @@
               <w:rPr>
                 <w:sz w:val="19"/>
               </w:rPr>
-              <w:t>Cash at Hand / Cash at Bank</w:t>
+              <w:t>Account Balance</w:t>
             </w:r>
           </w:p>
         </w:tc>
         <w:tc>
           <w:tcPr>
             <w:tcW w:type="dxa" w:w="4873"/>
+          </w:tcPr>
+          <w:p>
+            <w:r>
+              <w:rPr>
+                <w:sz w:val="19"/>
+              </w:rPr>
+            </w:r>
+            <w:r>
+              <w:rPr>
+                <w:sz w:val="19"/>
+              </w:rPr>
+              <w:t>§11.4</w:t>
+            </w:r>
+          </w:p>
+        </w:tc>
+      </w:tr>
+      <w:tr>
+        <w:tc>
+          <w:tcPr>
+            <w:tcW w:type="dxa" w:w="4873"/>
+            <w:shd w:val="clear" w:color="auto" w:fill="F2F5FB"/>
+          </w:tcPr>
+          <w:p>
+            <w:r>
+              <w:rPr>
+                <w:sz w:val="19"/>
+              </w:rPr>
+            </w:r>
+            <w:r>
+              <w:rPr>
+                <w:sz w:val="19"/>
+              </w:rPr>
+              <w:t>Cash at Hand / Cash at Bank</w:t>
+            </w:r>
+          </w:p>
+        </w:tc>
+        <w:tc>
+          <w:tcPr>
+            <w:tcW w:type="dxa" w:w="4873"/>
+            <w:shd w:val="clear" w:color="auto" w:fill="F2F5FB"/>
           </w:tcPr>
           <w:p>
             <w:r>
@@ -5216,7 +5421,7 @@
               <w:rPr>
                 <w:sz w:val="19"/>
               </w:rPr>
-              <w:t>#10</w:t>
+              <w:t>#10 (Company Income only)</w:t>
             </w:r>
           </w:p>
         </w:tc>
@@ -5237,7 +5442,7 @@
               <w:rPr>
                 <w:sz w:val="19"/>
               </w:rPr>
-              <w:t>Total Expenditure</w:t>
+              <w:t>Other Receipts</w:t>
             </w:r>
           </w:p>
         </w:tc>
@@ -5256,7 +5461,7 @@
               <w:rPr>
                 <w:sz w:val="19"/>
               </w:rPr>
-              <w:t>#16</w:t>
+              <w:t>#7 + #8 (not income)</w:t>
             </w:r>
           </w:p>
         </w:tc>
@@ -5276,7 +5481,7 @@
               <w:rPr>
                 <w:sz w:val="19"/>
               </w:rPr>
-              <w:t>Net Balance</w:t>
+              <w:t>Total Expenditure</w:t>
             </w:r>
           </w:p>
         </w:tc>
@@ -5294,7 +5499,7 @@
               <w:rPr>
                 <w:sz w:val="19"/>
               </w:rPr>
-              <w:t>#10 − #16</w:t>
+              <w:t>#16</w:t>
             </w:r>
           </w:p>
         </w:tc>
@@ -5315,7 +5520,7 @@
               <w:rPr>
                 <w:sz w:val="19"/>
               </w:rPr>
-              <w:t>Revenue by product (Savings/Loans/Susu/Card/SMS)</w:t>
+              <w:t>Net Balance</w:t>
             </w:r>
           </w:p>
         </w:tc>
@@ -5334,7 +5539,85 @@
               <w:rPr>
                 <w:sz w:val="19"/>
               </w:rPr>
-              <w:t>the matching individual base figures (#5, #4+#9, #6, #7, #8)</w:t>
+              <w:t>#10 − #16</w:t>
+            </w:r>
+          </w:p>
+        </w:tc>
+      </w:tr>
+      <w:tr>
+        <w:tc>
+          <w:tcPr>
+            <w:tcW w:type="dxa" w:w="4873"/>
+          </w:tcPr>
+          <w:p>
+            <w:r>
+              <w:rPr>
+                <w:sz w:val="19"/>
+              </w:rPr>
+            </w:r>
+            <w:r>
+              <w:rPr>
+                <w:sz w:val="19"/>
+              </w:rPr>
+              <w:t>Revenue by product — Company Income (Savings/Loans/Susu)</w:t>
+            </w:r>
+          </w:p>
+        </w:tc>
+        <w:tc>
+          <w:tcPr>
+            <w:tcW w:type="dxa" w:w="4873"/>
+          </w:tcPr>
+          <w:p>
+            <w:r>
+              <w:rPr>
+                <w:sz w:val="19"/>
+              </w:rPr>
+            </w:r>
+            <w:r>
+              <w:rPr>
+                <w:sz w:val="19"/>
+              </w:rPr>
+              <w:t>matching individual base figures (#5, #4+#9, #6)</w:t>
+            </w:r>
+          </w:p>
+        </w:tc>
+      </w:tr>
+      <w:tr>
+        <w:tc>
+          <w:tcPr>
+            <w:tcW w:type="dxa" w:w="4873"/>
+            <w:shd w:val="clear" w:color="auto" w:fill="F2F5FB"/>
+          </w:tcPr>
+          <w:p>
+            <w:r>
+              <w:rPr>
+                <w:sz w:val="19"/>
+              </w:rPr>
+            </w:r>
+            <w:r>
+              <w:rPr>
+                <w:sz w:val="19"/>
+              </w:rPr>
+              <w:t>Other receipts (Card Fees/SMS Fees)</w:t>
+            </w:r>
+          </w:p>
+        </w:tc>
+        <w:tc>
+          <w:tcPr>
+            <w:tcW w:type="dxa" w:w="4873"/>
+            <w:shd w:val="clear" w:color="auto" w:fill="F2F5FB"/>
+          </w:tcPr>
+          <w:p>
+            <w:r>
+              <w:rPr>
+                <w:sz w:val="19"/>
+              </w:rPr>
+            </w:r>
+            <w:r>
+              <w:rPr>
+                <w:sz w:val="19"/>
+              </w:rPr>
+              <w:t>#7, #8 — shown in their own section, separate from revenue</w:t>
             </w:r>
           </w:p>
         </w:tc>

</xml_diff>